<commit_message>
docs: add the framework big-picture diagram (phases, I/O, literature)
The item this actually was — architecture.puml/user-flow.puml are
technical system/sequence diagrams, not the conceptual framework
overview the thesis backlog asked for.

Adds a phase-by-phase diagram (Strategic Alignment through Maintenance)
showing each phase's input, output, and the literature it's grounded
in, plus the governed Maintenance loop-back (change request -> Discovery,
Secure Lane -> Testing) as an explicit answer to being read as linear/
Waterfall. Two notations: a PlantUML flow (rendered PNG/SVG) and a
standards-compliant BPMN 2.0 file, openable in any BPMN tool — verified
by rendering both (PlantUML via the existing toolchain, BPMN via a
disposable bpmn-js harness) before committing. Embedded into
Apex-Framework-v2.docx as Figure 1.
</commit_message>
<xml_diff>
--- a/docs/framework/Apex-Framework-v2.docx
+++ b/docs/framework/Apex-Framework-v2.docx
@@ -413,6 +413,52 @@
           <w:i w:val="0"/>
         </w:rPr>
         <w:t>The framework's most direct real-world precedent is AWS's AI-Driven Development Lifecycle (AI-DLC), published by AWS Principal Solutions Architect Raja SP (Raja SP, 2025) and presented at AWS re:Invent 2025. AI-DLC organizes work into Inception, Construction, and Operations, replaces sprints with “Bolts,” replaces Epics with “Units of Work,” and governs AI participation through Mob Elaboration and Mob Construction. This is the direct source of this framework's “Bolt,” “Unit of Work,” and “Mob Elaboration” terminology. This framework deliberately extends AI-DLC's three phases into six — AWS's own material folds Testing and Maintenance into Construction and Operations respectively, with no phase-specific gate or role separation; this framework adds a decoupled Testing phase and a distinct Maintenance phase with its own diagnostic firewall because Apex — and any team operating this framework at more than toy scale — needs both.</w:t>
+      </w:r>
+    </w:p>
+    <w:p>
+      <w:r>
+        <w:drawing>
+          <wp:inline xmlns:a="http://schemas.openxmlformats.org/drawingml/2006/main" xmlns:pic="http://schemas.openxmlformats.org/drawingml/2006/picture">
+            <wp:extent cx="6035040" cy="2030860"/>
+            <wp:docPr id="1" name="Picture 1"/>
+            <wp:cNvGraphicFramePr>
+              <a:graphicFrameLocks noChangeAspect="1"/>
+            </wp:cNvGraphicFramePr>
+            <a:graphic>
+              <a:graphicData uri="http://schemas.openxmlformats.org/drawingml/2006/picture">
+                <pic:pic>
+                  <pic:nvPicPr>
+                    <pic:cNvPr id="0" name="big-picture.png"/>
+                    <pic:cNvPicPr/>
+                  </pic:nvPicPr>
+                  <pic:blipFill>
+                    <a:blip r:embed="rId9"/>
+                    <a:stretch>
+                      <a:fillRect/>
+                    </a:stretch>
+                  </pic:blipFill>
+                  <pic:spPr>
+                    <a:xfrm>
+                      <a:off x="0" y="0"/>
+                      <a:ext cx="6035040" cy="2030860"/>
+                    </a:xfrm>
+                    <a:prstGeom prst="rect"/>
+                  </pic:spPr>
+                </pic:pic>
+              </a:graphicData>
+            </a:graphic>
+          </wp:inline>
+        </w:drawing>
+      </w:r>
+    </w:p>
+    <w:p>
+      <w:r>
+        <w:rPr>
+          <w:i/>
+          <w:color w:val="555555"/>
+          <w:sz w:val="18"/>
+        </w:rPr>
+        <w:t>Figure 1. The framework's seven phases end to end — input, output, and the literature grounding each phase draws on. Maintenance's loop-back is governed (a classified signal re-opens a specific named phase), not a raw patch, which is the framework's explicit answer to being read as linear/Waterfall.</w:t>
       </w:r>
     </w:p>
     <w:tbl>

</xml_diff>

<commit_message>
docs: add architecture and user-flow diagrams to framework v2 (Figures 2-3)
</commit_message>
<xml_diff>
--- a/docs/framework/Apex-Framework-v2.docx
+++ b/docs/framework/Apex-Framework-v2.docx
@@ -57,6 +57,14 @@
       </w:pPr>
       <w:r>
         <w:t>v2 (this document): (1) grounds every borrowed construct in a cited primary source, not asserted resemblance; (2) drops the DevOps Alliance role — its two responsibilities (deployment approval, IaC security review) are absorbed by whoever is performing the deployment, no replacement hat; (3) reframes every role as a hat, not a person — one person may hold several hats, and any hat may go unfilled on a small team, since the framework is meant for anyone with a technical background, solo or in a small team, not an org chart; (4) keeps “Bolt” terminology exactly as in v1 — it is sourced directly from AWS AI-DLC and was confirmed settled, unlike the other role names; (5) references Apex, the framework's reference implementation, at the point each mechanism is described, including its now-shipped Bolt Board (a dedicated page tracking each Bolt's pack_ready → pushed → done lifecycle, with a real Bolt Cycle Time metric).</w:t>
+      </w:r>
+    </w:p>
+    <w:p>
+      <w:pPr>
+        <w:pStyle w:val="ListBullet"/>
+      </w:pPr>
+      <w:r>
+        <w:t>v2.1: added Figures 2–3 — Apex's reference architecture and a representative user flow through the phases — to §2, so the reference implementation is shown, not only described.</w:t>
       </w:r>
     </w:p>
     <w:p>
@@ -224,6 +232,104 @@
           <w:i w:val="0"/>
         </w:rPr>
         <w:t>What's deliberately out of scope for Apex specifically (not the framework): model training/fine-tuning, infrastructure provisioning beyond generating IaC scripts for human/CI execution, and any PM-tool replacement — Apex sits above Taiga/Jira as a reasoning layer, not a competing board.</w:t>
+      </w:r>
+    </w:p>
+    <w:p>
+      <w:pPr>
+        <w:jc w:val="center"/>
+      </w:pPr>
+      <w:r>
+        <w:drawing>
+          <wp:inline xmlns:a="http://schemas.openxmlformats.org/drawingml/2006/main" xmlns:pic="http://schemas.openxmlformats.org/drawingml/2006/picture">
+            <wp:extent cx="5760720" cy="1610690"/>
+            <wp:docPr id="2" name="Picture 2"/>
+            <wp:cNvGraphicFramePr>
+              <a:graphicFrameLocks noChangeAspect="1"/>
+            </wp:cNvGraphicFramePr>
+            <a:graphic>
+              <a:graphicData uri="http://schemas.openxmlformats.org/drawingml/2006/picture">
+                <pic:pic>
+                  <pic:nvPicPr>
+                    <pic:cNvPr id="0" name="architecture.png"/>
+                    <pic:cNvPicPr/>
+                  </pic:nvPicPr>
+                  <pic:blipFill>
+                    <a:blip r:embed="rId10"/>
+                    <a:stretch>
+                      <a:fillRect/>
+                    </a:stretch>
+                  </pic:blipFill>
+                  <pic:spPr>
+                    <a:xfrm>
+                      <a:off x="0" y="0"/>
+                      <a:ext cx="5760720" cy="1610690"/>
+                    </a:xfrm>
+                    <a:prstGeom prst="rect"/>
+                  </pic:spPr>
+                </pic:pic>
+              </a:graphicData>
+            </a:graphic>
+          </wp:inline>
+        </w:drawing>
+      </w:r>
+    </w:p>
+    <w:p>
+      <w:pPr/>
+      <w:r>
+        <w:rPr>
+          <w:i/>
+          <w:sz w:val="18"/>
+        </w:rPr>
+        <w:t>Figure 2. Apex's reference architecture — the Next.js 15 frontend, the FastAPI backend, the SSRF-guarded Taiga/Jira/Figma/GitHub proxies, and spec-anchored storage under contextspec/&lt;instance_id&gt;/&lt;project_id&gt;/.</w:t>
+      </w:r>
+    </w:p>
+    <w:p>
+      <w:pPr>
+        <w:jc w:val="center"/>
+      </w:pPr>
+      <w:r>
+        <w:drawing>
+          <wp:inline xmlns:a="http://schemas.openxmlformats.org/drawingml/2006/main" xmlns:pic="http://schemas.openxmlformats.org/drawingml/2006/picture">
+            <wp:extent cx="3840480" cy="7351073"/>
+            <wp:docPr id="3" name="Picture 3"/>
+            <wp:cNvGraphicFramePr>
+              <a:graphicFrameLocks noChangeAspect="1"/>
+            </wp:cNvGraphicFramePr>
+            <a:graphic>
+              <a:graphicData uri="http://schemas.openxmlformats.org/drawingml/2006/picture">
+                <pic:pic>
+                  <pic:nvPicPr>
+                    <pic:cNvPr id="0" name="user-flow.png"/>
+                    <pic:cNvPicPr/>
+                  </pic:nvPicPr>
+                  <pic:blipFill>
+                    <a:blip r:embed="rId11"/>
+                    <a:stretch>
+                      <a:fillRect/>
+                    </a:stretch>
+                  </pic:blipFill>
+                  <pic:spPr>
+                    <a:xfrm>
+                      <a:off x="0" y="0"/>
+                      <a:ext cx="3840480" cy="7351073"/>
+                    </a:xfrm>
+                    <a:prstGeom prst="rect"/>
+                  </pic:spPr>
+                </pic:pic>
+              </a:graphicData>
+            </a:graphic>
+          </wp:inline>
+        </w:drawing>
+      </w:r>
+    </w:p>
+    <w:p>
+      <w:pPr/>
+      <w:r>
+        <w:rPr>
+          <w:i/>
+          <w:sz w:val="18"/>
+        </w:rPr>
+        <w:t>Figure 3. A representative user flow through Apex, phase by phase — the same six SDLC phases from §5, as a user actually walks them.</w:t>
       </w:r>
     </w:p>
     <w:p>

</xml_diff>

<commit_message>
refactor: remove Jira PM-tool support, Taiga is now the only backend
Jira integration (backend proxy, frontend adapter, login UI, config
fields, docs, diagrams) is fully removed rather than left as dead code.
The Jira login form was already disabled in the UI, so this is pure
cleanup with no live feature loss. Taiga support is untouched.
</commit_message>
<xml_diff>
--- a/docs/framework/Apex-Framework-v2.docx
+++ b/docs/framework/Apex-Framework-v2.docx
@@ -241,7 +241,7 @@
           <w:b w:val="false"/>
           <w:i w:val="false"/>
         </w:rPr>
-        <w:t>Apex is the working reference implementation of this framework — a split-stack web app (Next.js 15 frontend, Python/FastAPI backend) that operationalizes every phase, gate, and artifact described in this document against a real project management backend (Taiga or Jira Cloud), with optional GitHub repository context and Figma design context. It exists to prove the framework's governance constructs are implementable, not just describable — every “Reference implementation” note throughout this document points to a concrete, shipped mechanism inside it, not a hypothetical.</w:t>
+        <w:t>Apex is the working reference implementation of this framework — a split-stack web app (Next.js 15 frontend, Python/FastAPI backend) that operationalizes every phase, gate, and artifact described in this document against a real project management backend (Taiga), with optional GitHub repository context and Figma design context. It exists to prove the framework's governance constructs are implementable, not just describable — every “Reference implementation” note throughout this document points to a concrete, shipped mechanism inside it, not a hypothetical.</w:t>
       </w:r>
     </w:p>
     <w:p>
@@ -364,7 +364,7 @@
           <w:b w:val="false"/>
           <w:i w:val="false"/>
         </w:rPr>
-        <w:t>What's deliberately out of scope for Apex specifically (not the framework): model training/fine-tuning, infrastructure provisioning beyond generating IaC scripts for human/CI execution, and any PM-tool replacement — Apex sits above Taiga/Jira as a reasoning layer, not a competing board.</w:t>
+        <w:t>What's deliberately out of scope for Apex specifically (not the framework): model training/fine-tuning, infrastructure provisioning beyond generating IaC scripts for human/CI execution, and any PM-tool replacement — Apex sits above Taiga as a reasoning layer, not a competing board.</w:t>
       </w:r>
     </w:p>
     <w:p>
@@ -424,7 +424,7 @@
           <w:i/>
           <w:sz w:val="18"/>
         </w:rPr>
-        <w:t>Figure 2. Apex's reference architecture — the Next.js 15 frontend, the FastAPI backend, the SSRF-guarded Taiga/Jira/Figma/GitHub proxies, and spec-anchored storage under contextspec/&lt;instance_id&gt;/&lt;project_id&gt;/.</w:t>
+        <w:t>Figure 2. Apex's reference architecture — the Next.js 15 frontend, the FastAPI backend, the SSRF-guarded Taiga/Figma/GitHub proxies, and spec-anchored storage under contextspec/&lt;instance_id&gt;/&lt;project_id&gt;/.</w:t>
       </w:r>
     </w:p>
     <w:p>
@@ -2773,7 +2773,7 @@
           <w:color w:val="555555"/>
           <w:sz w:val="19"/>
         </w:rPr>
-        <w:t>Reference implementation — Apex tracks each task's Bolt lifecycle explicitly: pack_ready (a developer pack is saved) → pushed (sent to the PM tool) → done (a Mark Bolt Done action, since Apex has no read-back of a pushed subtask's completion state from Taiga/Jira). This is stored per-task under the story's index entry, independent of the story's own phase status, and surfaced on a dedicated Bolts page: an explainer, a project-wide board grouped by status and filterable by epic, and a Customize panel for per-team status labels and a cycle-time threshold that flags slow Bolts. This is the framework's Bolt concept made genuinely trackable, not just named.</w:t>
+        <w:t>Reference implementation — Apex tracks each task's Bolt lifecycle explicitly: pack_ready (a developer pack is saved) → pushed (sent to the PM tool) → done (a Mark Bolt Done action, since Apex has no read-back of a pushed subtask's completion state from Taiga). This is stored per-task under the story's index entry, independent of the story's own phase status, and surfaced on a dedicated Bolts page: an explainer, a project-wide board grouped by status and filterable by epic, and a Customize panel for per-team status labels and a cycle-time threshold that flags slow Bolts. This is the framework's Bolt concept made genuinely trackable, not just named.</w:t>
       </w:r>
     </w:p>
     <w:p>
@@ -3116,7 +3116,7 @@
           <w:color w:val="555555"/>
           <w:sz w:val="19"/>
         </w:rPr>
-        <w:t>These state names are guidance, not a literal requirement to reproduce in any specific PM tool's board columns — Apex deliberately does not enforce them as fixed board-column names. Apex's own internal phase_status enum (new/gherkin_locked/design_locked/implementation/qa/qa_passed/deployed) is close in spirit but not identical, and a project's actual Taiga/Jira board columns are left team-configurable via a Settings → Status Mapping feature that maps whatever a team already calls its columns onto these internal phases — because teams already have their own boards, and this framework's job is to reason over them, not replace them. Separately, and more literally matching this section's Bolt-visibility intent, Apex's dedicated Bolts page gives the Bolt Backlog concept — the per-task, not per-story, work queue — its own real board, grouped by pack_ready/pushed/done.</w:t>
+        <w:t>These state names are guidance, not a literal requirement to reproduce in any specific PM tool's board columns — Apex deliberately does not enforce them as fixed board-column names. Apex's own internal phase_status enum (new/gherkin_locked/design_locked/implementation/qa/qa_passed/deployed) is close in spirit but not identical, and a project's actual Taiga board columns are left team-configurable via a Settings → Status Mapping feature that maps whatever a team already calls its columns onto these internal phases — because teams already have their own boards, and this framework's job is to reason over them, not replace them. Separately, and more literally matching this section's Bolt-visibility intent, Apex's dedicated Bolts page gives the Bolt Backlog concept — the per-task, not per-story, work queue — its own real board, grouped by pack_ready/pushed/done.</w:t>
       </w:r>
     </w:p>
     <w:p>

</xml_diff>